<commit_message>
chore: checkpoint antes das correcoes de destino e assunto no gerador de oficios
</commit_message>
<xml_diff>
--- a/eventos/resources/documentos/oficio_model.docx
+++ b/eventos/resources/documentos/oficio_model.docx
@@ -13,23 +13,22 @@
     </w:p>
     <w:tbl>
       <w:tblPr>
-        <w:tblStyle w:val="a"/>
-        <w:tblW w:w="11010" w:type="dxa"/>
+        <w:tblW w:w="11277" w:type="dxa"/>
         <w:tblInd w:w="-3" w:type="dxa"/>
         <w:tblBorders>
-          <w:top w:val="single" w:color="000000" w:sz="4" w:space="0"/>
-          <w:left w:val="single" w:color="000000" w:sz="4" w:space="0"/>
-          <w:bottom w:val="single" w:color="000000" w:sz="4" w:space="0"/>
-          <w:right w:val="single" w:color="000000" w:sz="4" w:space="0"/>
-          <w:insideH w:val="single" w:color="000000" w:sz="4" w:space="0"/>
-          <w:insideV w:val="single" w:color="000000" w:sz="4" w:space="0"/>
+          <w:top w:val="single" w:color="000000" w:themeColor="text1" w:sz="4" w:space="0"/>
+          <w:left w:val="single" w:color="000000" w:themeColor="text1" w:sz="4" w:space="0"/>
+          <w:bottom w:val="single" w:color="000000" w:themeColor="text1" w:sz="4" w:space="0"/>
+          <w:right w:val="single" w:color="000000" w:themeColor="text1" w:sz="4" w:space="0"/>
+          <w:insideH w:val="single" w:color="000000" w:themeColor="text1" w:sz="4" w:space="0"/>
+          <w:insideV w:val="single" w:color="000000" w:themeColor="text1" w:sz="4" w:space="0"/>
         </w:tblBorders>
         <w:tblLayout w:type="fixed"/>
         <w:tblLook w:val="0600" w:firstRow="0" w:lastRow="0" w:firstColumn="0" w:lastColumn="0" w:noHBand="1" w:noVBand="1"/>
       </w:tblPr>
       <w:tblGrid>
         <w:gridCol w:w="5580"/>
-        <w:gridCol w:w="5430"/>
+        <w:gridCol w:w="5697"/>
       </w:tblGrid>
       <w:tr xmlns:wp14="http://schemas.microsoft.com/office/word/2010/wordml" wp14:textId="77777777">
         <w:trPr>
@@ -83,7 +82,7 @@
         </w:tc>
         <w:tc>
           <w:tcPr>
-            <w:tcW w:w="5430" w:type="dxa"/>
+            <w:tcW w:w="5697" w:type="dxa"/>
             <w:tcMar>
               <w:top w:w="113" w:type="dxa"/>
               <w:left w:w="113" w:type="dxa"/>
@@ -186,7 +185,7 @@
         </w:tc>
         <w:tc>
           <w:tcPr>
-            <w:tcW w:w="5430" w:type="dxa"/>
+            <w:tcW w:w="5697" w:type="dxa"/>
             <w:tcMar>
               <w:top w:w="113" w:type="dxa"/>
               <w:left w:w="113" w:type="dxa"/>
@@ -259,7 +258,7 @@
         </w:tc>
         <w:tc>
           <w:tcPr>
-            <w:tcW w:w="5430" w:type="dxa"/>
+            <w:tcW w:w="5697" w:type="dxa"/>
             <w:tcMar>
               <w:top w:w="113" w:type="dxa"/>
               <w:left w:w="113" w:type="dxa"/>
@@ -297,27 +296,26 @@
         </w:tc>
       </w:tr>
     </w:tbl>
-    <w:p xmlns:wp14="http://schemas.microsoft.com/office/word/2010/wordml" wp14:textId="77777777">
+    <w:p xmlns:wp14="http://schemas.microsoft.com/office/word/2010/wordml" wp14:textId="085B9FF6">
       <w:pPr>
-        <w:ind w:left="-90"/>
+        <w:spacing w:before="100" w:beforeAutospacing="off" w:after="100" w:afterAutospacing="off" w:line="240" w:lineRule="auto"/>
+        <w:ind w:left="-90" w:right="0"/>
         <w:jc w:val="center"/>
         <w:rPr>
           <w:rFonts w:ascii="Times New Roman" w:hAnsi="Times New Roman" w:eastAsia="Times New Roman" w:cs="Times New Roman"/>
-          <w:color w:val="000000"/>
-          <w:sz w:val="12"/>
-          <w:szCs w:val="12"/>
+          <w:b w:val="1"/>
+          <w:bCs w:val="1"/>
+          <w:color w:val="262626"/>
+          <w:sz w:val="16"/>
+          <w:szCs w:val="16"/>
         </w:rPr>
-      </w:pPr>
-    </w:p>
-    <w:p xmlns:wp14="http://schemas.microsoft.com/office/word/2010/wordml" wp14:textId="77777777">
-      <w:pPr>
-        <w:ind w:left="-90"/>
-        <w:jc w:val="center"/>
       </w:pPr>
       <w:r>
         <w:rPr>
           <w:rFonts w:ascii="Times New Roman" w:hAnsi="Times New Roman" w:eastAsia="Times New Roman" w:cs="Times New Roman"/>
-          <w:color w:val="000000"/>
+          <w:b w:val="1"/>
+          <w:bCs w:val="1"/>
+          <w:color w:val="000000" w:themeColor="text1" w:themeTint="FF" w:themeShade="FF"/>
           <w:sz w:val="16"/>
           <w:szCs w:val="16"/>
         </w:rPr>
@@ -326,7 +324,9 @@
       <w:r>
         <w:rPr>
           <w:rFonts w:ascii="Times New Roman" w:hAnsi="Times New Roman" w:eastAsia="Times New Roman" w:cs="Times New Roman"/>
-          <w:color w:val="262626"/>
+          <w:b w:val="1"/>
+          <w:bCs w:val="1"/>
+          <w:color w:val="262626" w:themeColor="text1" w:themeTint="D9" w:themeShade="FF"/>
           <w:sz w:val="16"/>
           <w:szCs w:val="16"/>
         </w:rPr>
@@ -335,46 +335,59 @@
       <w:r>
         <w:rPr>
           <w:rFonts w:ascii="Times New Roman" w:hAnsi="Times New Roman" w:eastAsia="Times New Roman" w:cs="Times New Roman"/>
-          <w:color w:val="262626"/>
+          <w:b w:val="1"/>
+          <w:bCs w:val="1"/>
+          <w:color w:val="262626" w:themeColor="text1" w:themeTint="D9" w:themeShade="FF"/>
           <w:sz w:val="16"/>
           <w:szCs w:val="16"/>
         </w:rPr>
-        <w:t>{{assunto_termo}}</w:t>
+        <w:t>{{</w:t>
       </w:r>
       <w:r>
         <w:rPr>
           <w:rFonts w:ascii="Times New Roman" w:hAnsi="Times New Roman" w:eastAsia="Times New Roman" w:cs="Times New Roman"/>
-          <w:color w:val="262626"/>
+          <w:b w:val="1"/>
+          <w:bCs w:val="1"/>
+          <w:color w:val="262626" w:themeColor="text1" w:themeTint="D9" w:themeShade="FF"/>
+          <w:sz w:val="16"/>
+          <w:szCs w:val="16"/>
+        </w:rPr>
+        <w:t>assunto_termo</w:t>
+      </w:r>
+      <w:r>
+        <w:rPr>
+          <w:rFonts w:ascii="Times New Roman" w:hAnsi="Times New Roman" w:eastAsia="Times New Roman" w:cs="Times New Roman"/>
+          <w:b w:val="1"/>
+          <w:bCs w:val="1"/>
+          <w:color w:val="262626" w:themeColor="text1" w:themeTint="D9" w:themeShade="FF"/>
+          <w:sz w:val="16"/>
+          <w:szCs w:val="16"/>
+        </w:rPr>
+        <w:t>}}</w:t>
+      </w:r>
+      <w:r>
+        <w:rPr>
+          <w:rFonts w:ascii="Times New Roman" w:hAnsi="Times New Roman" w:eastAsia="Times New Roman" w:cs="Times New Roman"/>
+          <w:b w:val="1"/>
+          <w:bCs w:val="1"/>
+          <w:color w:val="262626" w:themeColor="text1" w:themeTint="D9" w:themeShade="FF"/>
           <w:sz w:val="16"/>
           <w:szCs w:val="16"/>
         </w:rPr>
         <w:t xml:space="preserve"> e medidas para a concessão de diárias e recursos para combustível, conforme cronograma abaixo:</w:t>
       </w:r>
     </w:p>
-    <w:p xmlns:wp14="http://schemas.microsoft.com/office/word/2010/wordml" wp14:textId="77777777">
-      <w:pPr>
-        <w:ind w:left="-90"/>
-        <w:jc w:val="center"/>
-        <w:rPr>
-          <w:rFonts w:ascii="Times New Roman" w:hAnsi="Times New Roman" w:eastAsia="Times New Roman" w:cs="Times New Roman"/>
-          <w:color w:val="262626"/>
-          <w:sz w:val="12"/>
-          <w:szCs w:val="12"/>
-        </w:rPr>
-      </w:pPr>
-    </w:p>
     <w:tbl>
       <w:tblPr>
-        <w:tblStyle w:val="a0"/>
-        <w:tblW w:w="11010" w:type="dxa"/>
+        <w:tblW w:w="11277" w:type="dxa"/>
         <w:tblInd w:w="-3" w:type="dxa"/>
         <w:tblBorders>
-          <w:top w:val="single" w:color="000000" w:sz="4" w:space="0"/>
-          <w:left w:val="single" w:color="000000" w:sz="4" w:space="0"/>
-          <w:bottom w:val="single" w:color="000000" w:sz="4" w:space="0"/>
-          <w:right w:val="single" w:color="000000" w:sz="4" w:space="0"/>
-          <w:insideH w:val="single" w:color="000000" w:sz="4" w:space="0"/>
-          <w:insideV w:val="single" w:color="000000" w:sz="4" w:space="0"/>
+          <w:top w:val="single" w:color="000000" w:themeColor="text1" w:sz="4" w:space="0"/>
+          <w:left w:val="single" w:color="000000" w:themeColor="text1" w:sz="4" w:space="0"/>
+          <w:bottom w:val="single" w:color="000000" w:themeColor="text1" w:sz="4" w:space="0"/>
+          <w:right w:val="single" w:color="000000" w:themeColor="text1" w:sz="4" w:space="0"/>
+          <w:insideH w:val="single" w:color="000000" w:themeColor="text1" w:sz="4" w:space="0"/>
+          <w:insideV w:val="single" w:color="000000" w:themeColor="text1" w:sz="4" w:space="0"/>
         </w:tblBorders>
         <w:tblLayout w:type="fixed"/>
         <w:tblLook w:val="0600" w:firstRow="0" w:lastRow="0" w:firstColumn="0" w:lastColumn="0" w:noHBand="1" w:noVBand="1"/>
@@ -383,7 +396,7 @@
         <w:gridCol w:w="2790"/>
         <w:gridCol w:w="2790"/>
         <w:gridCol w:w="2790"/>
-        <w:gridCol w:w="2640"/>
+        <w:gridCol w:w="2907"/>
       </w:tblGrid>
       <w:tr xmlns:wp14="http://schemas.microsoft.com/office/word/2010/wordml" wp14:textId="77777777">
         <w:trPr>
@@ -482,7 +495,7 @@
         </w:tc>
         <w:tc>
           <w:tcPr>
-            <w:tcW w:w="2640" w:type="dxa"/>
+            <w:tcW w:w="2907" w:type="dxa"/>
             <w:tcMar>
               <w:top w:w="113" w:type="dxa"/>
               <w:left w:w="113" w:type="dxa"/>
@@ -618,7 +631,7 @@
         </w:tc>
         <w:tc>
           <w:tcPr>
-            <w:tcW w:w="2640" w:type="dxa"/>
+            <w:tcW w:w="2907" w:type="dxa"/>
             <w:tcMar>
               <w:top w:w="113" w:type="dxa"/>
               <w:left w:w="113" w:type="dxa"/>
@@ -660,7 +673,7 @@
     </w:p>
     <w:tbl>
       <w:tblPr>
-        <w:tblW w:w="11035" w:type="dxa"/>
+        <w:tblW w:w="11283" w:type="dxa"/>
         <w:tblInd w:w="-3" w:type="dxa"/>
         <w:tblBorders>
           <w:top w:val="single" w:color="000000" w:themeColor="text1" w:sz="4" w:space="0"/>
@@ -674,9 +687,9 @@
         <w:tblLook w:val="0600" w:firstRow="0" w:lastRow="0" w:firstColumn="0" w:lastColumn="0" w:noHBand="1" w:noVBand="1"/>
       </w:tblPr>
       <w:tblGrid>
-        <w:gridCol w:w="5583"/>
-        <w:gridCol w:w="2802"/>
-        <w:gridCol w:w="2650"/>
+        <w:gridCol w:w="3678"/>
+        <w:gridCol w:w="3678"/>
+        <w:gridCol w:w="3927"/>
       </w:tblGrid>
       <w:tr xmlns:wp14="http://schemas.microsoft.com/office/word/2010/wordml" wp14:textId="77777777">
         <w:trPr>
@@ -684,7 +697,7 @@
         </w:trPr>
         <w:tc>
           <w:tcPr>
-            <w:tcW w:w="5583" w:type="dxa"/>
+            <w:tcW w:w="3678" w:type="dxa"/>
             <w:tcMar>
               <w:top w:w="113" w:type="dxa"/>
               <w:left w:w="113" w:type="dxa"/>
@@ -695,6 +708,7 @@
           </w:tcPr>
           <w:p wp14:textId="77777777">
             <w:pPr>
+              <w:jc w:val="center"/>
               <w:rPr>
                 <w:sz w:val="12"/>
                 <w:szCs w:val="12"/>
@@ -703,19 +717,41 @@
             <w:r>
               <w:rPr>
                 <w:rFonts w:ascii="Times New Roman" w:hAnsi="Times New Roman" w:eastAsia="Times New Roman" w:cs="Times New Roman"/>
-                <w:b/>
-                <w:bCs/>
-                <w:color w:val="000000"/>
-                <w:sz w:val="16"/>
-                <w:szCs w:val="16"/>
-              </w:rPr>
-              <w:t>Destino da Viagem: {{destinos_bloco}}</w:t>
+                <w:b w:val="1"/>
+                <w:bCs w:val="1"/>
+                <w:color w:val="000000" w:themeColor="text1" w:themeTint="FF" w:themeShade="FF"/>
+                <w:sz w:val="16"/>
+                <w:szCs w:val="16"/>
+              </w:rPr>
+              <w:t>Destino da Viagem: {{</w:t>
+            </w:r>
+            <w:r>
+              <w:rPr>
+                <w:rFonts w:ascii="Times New Roman" w:hAnsi="Times New Roman" w:eastAsia="Times New Roman" w:cs="Times New Roman"/>
+                <w:b w:val="1"/>
+                <w:bCs w:val="1"/>
+                <w:color w:val="000000" w:themeColor="text1" w:themeTint="FF" w:themeShade="FF"/>
+                <w:sz w:val="16"/>
+                <w:szCs w:val="16"/>
+              </w:rPr>
+              <w:t>destinos_bloco</w:t>
+            </w:r>
+            <w:r>
+              <w:rPr>
+                <w:rFonts w:ascii="Times New Roman" w:hAnsi="Times New Roman" w:eastAsia="Times New Roman" w:cs="Times New Roman"/>
+                <w:b w:val="1"/>
+                <w:bCs w:val="1"/>
+                <w:color w:val="000000" w:themeColor="text1" w:themeTint="FF" w:themeShade="FF"/>
+                <w:sz w:val="16"/>
+                <w:szCs w:val="16"/>
+              </w:rPr>
+              <w:t>}}</w:t>
             </w:r>
           </w:p>
         </w:tc>
         <w:tc>
           <w:tcPr>
-            <w:tcW w:w="2802" w:type="dxa"/>
+            <w:tcW w:w="3678" w:type="dxa"/>
             <w:tcMar>
               <w:top w:w="113" w:type="dxa"/>
               <w:left w:w="113" w:type="dxa"/>
@@ -848,7 +884,7 @@
         </w:tc>
         <w:tc>
           <w:tcPr>
-            <w:tcW w:w="2650" w:type="dxa"/>
+            <w:tcW w:w="3927" w:type="dxa"/>
             <w:tcMar>
               <w:top w:w="113" w:type="dxa"/>
               <w:left w:w="113" w:type="dxa"/>
@@ -890,6 +926,7 @@
           </w:p>
           <w:p wp14:textId="08F95AAD">
             <w:pPr>
+              <w:jc w:val="center"/>
               <w:rPr>
                 <w:sz w:val="12"/>
                 <w:szCs w:val="12"/>
@@ -954,23 +991,11 @@
         </w:tc>
       </w:tr>
     </w:tbl>
-    <w:p xmlns:wp14="http://schemas.microsoft.com/office/word/2010/wordml" wp14:textId="77777777">
+    <w:p xmlns:wp14="http://schemas.microsoft.com/office/word/2010/wordml" wp14:textId="15655AD2">
       <w:pPr>
-        <w:ind w:left="-90"/>
-        <w:jc w:val="center"/>
-        <w:rPr>
-          <w:rFonts w:ascii="Times New Roman" w:hAnsi="Times New Roman" w:eastAsia="Times New Roman" w:cs="Times New Roman"/>
-          <w:b/>
-          <w:bCs/>
-          <w:color w:val="000000"/>
-          <w:sz w:val="12"/>
-          <w:szCs w:val="12"/>
-        </w:rPr>
-      </w:pPr>
-    </w:p>
-    <w:p xmlns:wp14="http://schemas.microsoft.com/office/word/2010/wordml" wp14:textId="77777777">
-      <w:pPr>
-        <w:ind w:left="-90"/>
+        <w:pStyle w:val="Normal"/>
+        <w:spacing w:before="100" w:beforeAutospacing="off" w:after="100" w:afterAutospacing="off" w:line="240" w:lineRule="auto"/>
+        <w:ind w:left="0"/>
         <w:jc w:val="center"/>
         <w:rPr>
           <w:rFonts w:ascii="Times New Roman" w:hAnsi="Times New Roman" w:eastAsia="Times New Roman" w:cs="Times New Roman"/>
@@ -981,48 +1006,33 @@
       <w:r>
         <w:rPr>
           <w:rFonts w:ascii="Times New Roman" w:hAnsi="Times New Roman" w:eastAsia="Times New Roman" w:cs="Times New Roman"/>
-          <w:b/>
-          <w:bCs/>
-          <w:color w:val="000000"/>
+          <w:b w:val="1"/>
+          <w:bCs w:val="1"/>
+          <w:color w:val="000000" w:themeColor="text1" w:themeTint="FF" w:themeShade="FF"/>
           <w:sz w:val="16"/>
           <w:szCs w:val="16"/>
         </w:rPr>
         <w:t>ROTEIRO DE IDA</w:t>
       </w:r>
     </w:p>
-    <w:p xmlns:wp14="http://schemas.microsoft.com/office/word/2010/wordml" wp14:textId="77777777">
-      <w:pPr>
-        <w:ind w:left="-90"/>
-        <w:jc w:val="center"/>
-        <w:rPr>
-          <w:rFonts w:ascii="Times New Roman" w:hAnsi="Times New Roman" w:eastAsia="Times New Roman" w:cs="Times New Roman"/>
-          <w:b/>
-          <w:bCs/>
-          <w:color w:val="000000"/>
-          <w:sz w:val="12"/>
-          <w:szCs w:val="12"/>
-        </w:rPr>
-      </w:pPr>
-    </w:p>
     <w:tbl>
       <w:tblPr>
-        <w:tblStyle w:val="a2"/>
-        <w:tblW w:w="11010" w:type="dxa"/>
+        <w:tblW w:w="11277" w:type="dxa"/>
         <w:tblInd w:w="-3" w:type="dxa"/>
         <w:tblBorders>
-          <w:top w:val="single" w:color="000000" w:sz="4" w:space="0"/>
-          <w:left w:val="single" w:color="000000" w:sz="4" w:space="0"/>
-          <w:bottom w:val="single" w:color="000000" w:sz="4" w:space="0"/>
-          <w:right w:val="single" w:color="000000" w:sz="4" w:space="0"/>
-          <w:insideH w:val="single" w:color="000000" w:sz="4" w:space="0"/>
-          <w:insideV w:val="single" w:color="000000" w:sz="4" w:space="0"/>
+          <w:top w:val="single" w:color="000000" w:themeColor="text1" w:sz="4" w:space="0"/>
+          <w:left w:val="single" w:color="000000" w:themeColor="text1" w:sz="4" w:space="0"/>
+          <w:bottom w:val="single" w:color="000000" w:themeColor="text1" w:sz="4" w:space="0"/>
+          <w:right w:val="single" w:color="000000" w:themeColor="text1" w:sz="4" w:space="0"/>
+          <w:insideH w:val="single" w:color="000000" w:themeColor="text1" w:sz="4" w:space="0"/>
+          <w:insideV w:val="single" w:color="000000" w:themeColor="text1" w:sz="4" w:space="0"/>
         </w:tblBorders>
         <w:tblLayout w:type="fixed"/>
         <w:tblLook w:val="0600" w:firstRow="0" w:lastRow="0" w:firstColumn="0" w:lastColumn="0" w:noHBand="1" w:noVBand="1"/>
       </w:tblPr>
       <w:tblGrid>
         <w:gridCol w:w="5580"/>
-        <w:gridCol w:w="5430"/>
+        <w:gridCol w:w="5697"/>
       </w:tblGrid>
       <w:tr xmlns:wp14="http://schemas.microsoft.com/office/word/2010/wordml" wp14:textId="77777777">
         <w:trPr>
@@ -1041,11 +1051,11 @@
           </w:tcPr>
           <w:p wp14:textId="77777777">
             <w:pPr>
-              <w:ind w:left="141"/>
-              <w:rPr>
-                <w:rFonts w:ascii="Times New Roman" w:hAnsi="Times New Roman" w:eastAsia="Times New Roman" w:cs="Times New Roman"/>
-                <w:b/>
-                <w:bCs/>
+              <w:ind w:left="0"/>
+              <w:rPr>
+                <w:rFonts w:ascii="Times New Roman" w:hAnsi="Times New Roman" w:eastAsia="Times New Roman" w:cs="Times New Roman"/>
+                <w:b w:val="1"/>
+                <w:bCs w:val="1"/>
                 <w:sz w:val="16"/>
                 <w:szCs w:val="16"/>
               </w:rPr>
@@ -1053,19 +1063,41 @@
             <w:r>
               <w:rPr>
                 <w:rFonts w:ascii="Times New Roman" w:hAnsi="Times New Roman" w:eastAsia="Times New Roman" w:cs="Times New Roman"/>
-                <w:b/>
-                <w:bCs/>
-                <w:color w:val="000000"/>
-                <w:sz w:val="16"/>
-                <w:szCs w:val="16"/>
-              </w:rPr>
-              <w:t>{{col_ida_saida}}</w:t>
+                <w:b w:val="1"/>
+                <w:bCs w:val="1"/>
+                <w:color w:val="000000" w:themeColor="text1" w:themeTint="FF" w:themeShade="FF"/>
+                <w:sz w:val="16"/>
+                <w:szCs w:val="16"/>
+              </w:rPr>
+              <w:t>{{</w:t>
+            </w:r>
+            <w:r>
+              <w:rPr>
+                <w:rFonts w:ascii="Times New Roman" w:hAnsi="Times New Roman" w:eastAsia="Times New Roman" w:cs="Times New Roman"/>
+                <w:b w:val="1"/>
+                <w:bCs w:val="1"/>
+                <w:color w:val="000000" w:themeColor="text1" w:themeTint="FF" w:themeShade="FF"/>
+                <w:sz w:val="16"/>
+                <w:szCs w:val="16"/>
+              </w:rPr>
+              <w:t>col_ida_saida</w:t>
+            </w:r>
+            <w:r>
+              <w:rPr>
+                <w:rFonts w:ascii="Times New Roman" w:hAnsi="Times New Roman" w:eastAsia="Times New Roman" w:cs="Times New Roman"/>
+                <w:b w:val="1"/>
+                <w:bCs w:val="1"/>
+                <w:color w:val="000000" w:themeColor="text1" w:themeTint="FF" w:themeShade="FF"/>
+                <w:sz w:val="16"/>
+                <w:szCs w:val="16"/>
+              </w:rPr>
+              <w:t>}}</w:t>
             </w:r>
           </w:p>
         </w:tc>
         <w:tc>
           <w:tcPr>
-            <w:tcW w:w="5430" w:type="dxa"/>
+            <w:tcW w:w="5697" w:type="dxa"/>
             <w:tcMar>
               <w:top w:w="113" w:type="dxa"/>
               <w:left w:w="113" w:type="dxa"/>
@@ -1076,7 +1108,7 @@
           </w:tcPr>
           <w:p wp14:textId="77777777">
             <w:pPr>
-              <w:ind w:left="141"/>
+              <w:ind w:left="0"/>
               <w:rPr>
                 <w:sz w:val="12"/>
                 <w:szCs w:val="12"/>
@@ -1085,38 +1117,49 @@
             <w:r>
               <w:rPr>
                 <w:rFonts w:ascii="Times New Roman" w:hAnsi="Times New Roman" w:eastAsia="Times New Roman" w:cs="Times New Roman"/>
-                <w:b/>
-                <w:bCs/>
-                <w:color w:val="000000"/>
-                <w:sz w:val="16"/>
-                <w:szCs w:val="16"/>
-              </w:rPr>
-              <w:t>{{col_ida_chegada}}</w:t>
+                <w:b w:val="1"/>
+                <w:bCs w:val="1"/>
+                <w:color w:val="000000" w:themeColor="text1" w:themeTint="FF" w:themeShade="FF"/>
+                <w:sz w:val="16"/>
+                <w:szCs w:val="16"/>
+              </w:rPr>
+              <w:t>{{</w:t>
+            </w:r>
+            <w:r>
+              <w:rPr>
+                <w:rFonts w:ascii="Times New Roman" w:hAnsi="Times New Roman" w:eastAsia="Times New Roman" w:cs="Times New Roman"/>
+                <w:b w:val="1"/>
+                <w:bCs w:val="1"/>
+                <w:color w:val="000000" w:themeColor="text1" w:themeTint="FF" w:themeShade="FF"/>
+                <w:sz w:val="16"/>
+                <w:szCs w:val="16"/>
+              </w:rPr>
+              <w:t>col_ida_chegada</w:t>
+            </w:r>
+            <w:r>
+              <w:rPr>
+                <w:rFonts w:ascii="Times New Roman" w:hAnsi="Times New Roman" w:eastAsia="Times New Roman" w:cs="Times New Roman"/>
+                <w:b w:val="1"/>
+                <w:bCs w:val="1"/>
+                <w:color w:val="000000" w:themeColor="text1" w:themeTint="FF" w:themeShade="FF"/>
+                <w:sz w:val="16"/>
+                <w:szCs w:val="16"/>
+              </w:rPr>
+              <w:t>}}</w:t>
             </w:r>
           </w:p>
         </w:tc>
       </w:tr>
     </w:tbl>
-    <w:p xmlns:wp14="http://schemas.microsoft.com/office/word/2010/wordml" wp14:textId="77777777">
+    <w:p xmlns:wp14="http://schemas.microsoft.com/office/word/2010/wordml" wp14:textId="2C4535F4">
       <w:pPr>
+        <w:spacing w:before="100" w:beforeAutospacing="off" w:after="100" w:afterAutospacing="off" w:line="240" w:lineRule="auto"/>
+        <w:ind w:left="-567" w:right="-567"/>
         <w:jc w:val="center"/>
         <w:rPr>
           <w:rFonts w:ascii="Times New Roman" w:hAnsi="Times New Roman" w:eastAsia="Times New Roman" w:cs="Times New Roman"/>
-          <w:b/>
-          <w:bCs/>
-          <w:color w:val="000000"/>
-          <w:sz w:val="12"/>
-          <w:szCs w:val="12"/>
-        </w:rPr>
-      </w:pPr>
-    </w:p>
-    <w:p xmlns:wp14="http://schemas.microsoft.com/office/word/2010/wordml" wp14:textId="77777777">
-      <w:pPr>
-        <w:jc w:val="center"/>
-        <w:rPr>
-          <w:rFonts w:ascii="Times New Roman" w:hAnsi="Times New Roman" w:eastAsia="Times New Roman" w:cs="Times New Roman"/>
-          <w:b/>
-          <w:bCs/>
+          <w:b w:val="1"/>
+          <w:bCs w:val="1"/>
           <w:color w:val="000000"/>
           <w:sz w:val="12"/>
           <w:szCs w:val="12"/>
@@ -1125,47 +1168,33 @@
       <w:r>
         <w:rPr>
           <w:rFonts w:ascii="Times New Roman" w:hAnsi="Times New Roman" w:eastAsia="Times New Roman" w:cs="Times New Roman"/>
-          <w:b/>
-          <w:bCs/>
-          <w:color w:val="000000"/>
+          <w:b w:val="1"/>
+          <w:bCs w:val="1"/>
+          <w:color w:val="000000" w:themeColor="text1" w:themeTint="FF" w:themeShade="FF"/>
           <w:sz w:val="16"/>
           <w:szCs w:val="16"/>
         </w:rPr>
         <w:t>ROTEIRO DE RETORNO</w:t>
       </w:r>
     </w:p>
-    <w:p xmlns:wp14="http://schemas.microsoft.com/office/word/2010/wordml" wp14:textId="77777777">
-      <w:pPr>
-        <w:jc w:val="center"/>
-        <w:rPr>
-          <w:rFonts w:ascii="Times New Roman" w:hAnsi="Times New Roman" w:eastAsia="Times New Roman" w:cs="Times New Roman"/>
-          <w:b/>
-          <w:bCs/>
-          <w:color w:val="000000"/>
-          <w:sz w:val="12"/>
-          <w:szCs w:val="12"/>
-        </w:rPr>
-      </w:pPr>
-    </w:p>
     <w:tbl>
       <w:tblPr>
-        <w:tblStyle w:val="a3"/>
-        <w:tblW w:w="11010" w:type="dxa"/>
+        <w:tblW w:w="11277" w:type="dxa"/>
         <w:tblInd w:w="-3" w:type="dxa"/>
         <w:tblBorders>
-          <w:top w:val="single" w:color="000000" w:sz="4" w:space="0"/>
-          <w:left w:val="single" w:color="000000" w:sz="4" w:space="0"/>
-          <w:bottom w:val="single" w:color="000000" w:sz="4" w:space="0"/>
-          <w:right w:val="single" w:color="000000" w:sz="4" w:space="0"/>
-          <w:insideH w:val="single" w:color="000000" w:sz="4" w:space="0"/>
-          <w:insideV w:val="single" w:color="000000" w:sz="4" w:space="0"/>
+          <w:top w:val="single" w:color="000000" w:themeColor="text1" w:sz="4" w:space="0"/>
+          <w:left w:val="single" w:color="000000" w:themeColor="text1" w:sz="4" w:space="0"/>
+          <w:bottom w:val="single" w:color="000000" w:themeColor="text1" w:sz="4" w:space="0"/>
+          <w:right w:val="single" w:color="000000" w:themeColor="text1" w:sz="4" w:space="0"/>
+          <w:insideH w:val="single" w:color="000000" w:themeColor="text1" w:sz="4" w:space="0"/>
+          <w:insideV w:val="single" w:color="000000" w:themeColor="text1" w:sz="4" w:space="0"/>
         </w:tblBorders>
         <w:tblLayout w:type="fixed"/>
         <w:tblLook w:val="0600" w:firstRow="0" w:lastRow="0" w:firstColumn="0" w:lastColumn="0" w:noHBand="1" w:noVBand="1"/>
       </w:tblPr>
       <w:tblGrid>
         <w:gridCol w:w="5580"/>
-        <w:gridCol w:w="5430"/>
+        <w:gridCol w:w="5697"/>
       </w:tblGrid>
       <w:tr xmlns:wp14="http://schemas.microsoft.com/office/word/2010/wordml" wp14:textId="77777777">
         <w:trPr>
@@ -1185,11 +1214,11 @@
           <w:p wp14:textId="77777777">
             <w:pPr>
               <w:widowControl w:val="0"/>
-              <w:ind w:left="141" w:right="67"/>
-              <w:rPr>
-                <w:rFonts w:ascii="Times New Roman" w:hAnsi="Times New Roman" w:eastAsia="Times New Roman" w:cs="Times New Roman"/>
-                <w:b/>
-                <w:bCs/>
+              <w:ind w:left="0" w:right="67"/>
+              <w:rPr>
+                <w:rFonts w:ascii="Times New Roman" w:hAnsi="Times New Roman" w:eastAsia="Times New Roman" w:cs="Times New Roman"/>
+                <w:b w:val="1"/>
+                <w:bCs w:val="1"/>
                 <w:sz w:val="16"/>
                 <w:szCs w:val="16"/>
               </w:rPr>
@@ -1197,18 +1226,38 @@
             <w:r>
               <w:rPr>
                 <w:rFonts w:ascii="Times New Roman" w:hAnsi="Times New Roman" w:eastAsia="Times New Roman" w:cs="Times New Roman"/>
-                <w:b/>
-                <w:bCs/>
-                <w:sz w:val="16"/>
-                <w:szCs w:val="16"/>
-              </w:rPr>
-              <w:t>{{col_volta_saida}}</w:t>
+                <w:b w:val="1"/>
+                <w:bCs w:val="1"/>
+                <w:sz w:val="16"/>
+                <w:szCs w:val="16"/>
+              </w:rPr>
+              <w:t>{{</w:t>
+            </w:r>
+            <w:r>
+              <w:rPr>
+                <w:rFonts w:ascii="Times New Roman" w:hAnsi="Times New Roman" w:eastAsia="Times New Roman" w:cs="Times New Roman"/>
+                <w:b w:val="1"/>
+                <w:bCs w:val="1"/>
+                <w:sz w:val="16"/>
+                <w:szCs w:val="16"/>
+              </w:rPr>
+              <w:t>col_volta_saida</w:t>
+            </w:r>
+            <w:r>
+              <w:rPr>
+                <w:rFonts w:ascii="Times New Roman" w:hAnsi="Times New Roman" w:eastAsia="Times New Roman" w:cs="Times New Roman"/>
+                <w:b w:val="1"/>
+                <w:bCs w:val="1"/>
+                <w:sz w:val="16"/>
+                <w:szCs w:val="16"/>
+              </w:rPr>
+              <w:t>}}</w:t>
             </w:r>
           </w:p>
         </w:tc>
         <w:tc>
           <w:tcPr>
-            <w:tcW w:w="5430" w:type="dxa"/>
+            <w:tcW w:w="5697" w:type="dxa"/>
             <w:tcMar>
               <w:top w:w="113" w:type="dxa"/>
               <w:left w:w="113" w:type="dxa"/>
@@ -1220,11 +1269,11 @@
           <w:p wp14:textId="77777777">
             <w:pPr>
               <w:widowControl w:val="0"/>
-              <w:ind w:left="141"/>
-              <w:rPr>
-                <w:rFonts w:ascii="Times New Roman" w:hAnsi="Times New Roman" w:eastAsia="Times New Roman" w:cs="Times New Roman"/>
-                <w:b/>
-                <w:bCs/>
+              <w:ind w:left="0"/>
+              <w:rPr>
+                <w:rFonts w:ascii="Times New Roman" w:hAnsi="Times New Roman" w:eastAsia="Times New Roman" w:cs="Times New Roman"/>
+                <w:b w:val="1"/>
+                <w:bCs w:val="1"/>
                 <w:sz w:val="16"/>
                 <w:szCs w:val="16"/>
               </w:rPr>
@@ -1232,12 +1281,32 @@
             <w:r>
               <w:rPr>
                 <w:rFonts w:ascii="Times New Roman" w:hAnsi="Times New Roman" w:eastAsia="Times New Roman" w:cs="Times New Roman"/>
-                <w:b/>
-                <w:bCs/>
-                <w:sz w:val="16"/>
-                <w:szCs w:val="16"/>
-              </w:rPr>
-              <w:t>{{col_volta_chegada}}</w:t>
+                <w:b w:val="1"/>
+                <w:bCs w:val="1"/>
+                <w:sz w:val="16"/>
+                <w:szCs w:val="16"/>
+              </w:rPr>
+              <w:t>{{</w:t>
+            </w:r>
+            <w:r>
+              <w:rPr>
+                <w:rFonts w:ascii="Times New Roman" w:hAnsi="Times New Roman" w:eastAsia="Times New Roman" w:cs="Times New Roman"/>
+                <w:b w:val="1"/>
+                <w:bCs w:val="1"/>
+                <w:sz w:val="16"/>
+                <w:szCs w:val="16"/>
+              </w:rPr>
+              <w:t>col_volta_chegada</w:t>
+            </w:r>
+            <w:r>
+              <w:rPr>
+                <w:rFonts w:ascii="Times New Roman" w:hAnsi="Times New Roman" w:eastAsia="Times New Roman" w:cs="Times New Roman"/>
+                <w:b w:val="1"/>
+                <w:bCs w:val="1"/>
+                <w:sz w:val="16"/>
+                <w:szCs w:val="16"/>
+              </w:rPr>
+              <w:t>}}</w:t>
             </w:r>
           </w:p>
         </w:tc>
@@ -1258,16 +1327,15 @@
     </w:p>
     <w:tbl>
       <w:tblPr>
-        <w:tblStyle w:val="a4"/>
-        <w:tblW w:w="11002" w:type="dxa"/>
+        <w:tblW w:w="11277" w:type="dxa"/>
         <w:tblInd w:w="-3" w:type="dxa"/>
         <w:tblBorders>
-          <w:top w:val="single" w:color="000000" w:sz="4" w:space="0"/>
-          <w:left w:val="single" w:color="000000" w:sz="4" w:space="0"/>
-          <w:bottom w:val="single" w:color="000000" w:sz="4" w:space="0"/>
-          <w:right w:val="single" w:color="000000" w:sz="4" w:space="0"/>
-          <w:insideH w:val="single" w:color="000000" w:sz="4" w:space="0"/>
-          <w:insideV w:val="single" w:color="000000" w:sz="4" w:space="0"/>
+          <w:top w:val="single" w:color="000000" w:themeColor="text1" w:sz="4" w:space="0"/>
+          <w:left w:val="single" w:color="000000" w:themeColor="text1" w:sz="4" w:space="0"/>
+          <w:bottom w:val="single" w:color="000000" w:themeColor="text1" w:sz="4" w:space="0"/>
+          <w:right w:val="single" w:color="000000" w:themeColor="text1" w:sz="4" w:space="0"/>
+          <w:insideH w:val="single" w:color="000000" w:themeColor="text1" w:sz="4" w:space="0"/>
+          <w:insideV w:val="single" w:color="000000" w:themeColor="text1" w:sz="4" w:space="0"/>
         </w:tblBorders>
         <w:tblLayout w:type="fixed"/>
         <w:tblLook w:val="0600" w:firstRow="0" w:lastRow="0" w:firstColumn="0" w:lastColumn="0" w:noHBand="1" w:noVBand="1"/>
@@ -1275,7 +1343,7 @@
       <w:tblGrid>
         <w:gridCol w:w="3735"/>
         <w:gridCol w:w="3735"/>
-        <w:gridCol w:w="3532"/>
+        <w:gridCol w:w="3807"/>
       </w:tblGrid>
       <w:tr xmlns:wp14="http://schemas.microsoft.com/office/word/2010/wordml" wp14:textId="77777777">
         <w:trPr>
@@ -1410,7 +1478,7 @@
         </w:tc>
         <w:tc>
           <w:tcPr>
-            <w:tcW w:w="3532" w:type="dxa"/>
+            <w:tcW w:w="3807" w:type="dxa"/>
             <w:tcMar>
               <w:top w:w="113" w:type="dxa"/>
               <w:left w:w="113" w:type="dxa"/>
@@ -1421,6 +1489,7 @@
           </w:tcPr>
           <w:p wp14:textId="77777777">
             <w:pPr>
+              <w:ind w:left="0"/>
               <w:rPr>
                 <w:sz w:val="12"/>
                 <w:szCs w:val="12"/>
@@ -1429,9 +1498,9 @@
             <w:r>
               <w:rPr>
                 <w:rFonts w:ascii="Times New Roman" w:hAnsi="Times New Roman" w:eastAsia="Times New Roman" w:cs="Times New Roman"/>
-                <w:b/>
-                <w:bCs/>
-                <w:color w:val="000000"/>
+                <w:b w:val="1"/>
+                <w:bCs w:val="1"/>
+                <w:color w:val="000000" w:themeColor="text1" w:themeTint="FF" w:themeShade="FF"/>
                 <w:sz w:val="16"/>
                 <w:szCs w:val="16"/>
               </w:rPr>
@@ -1441,14 +1510,15 @@
         </w:tc>
       </w:tr>
     </w:tbl>
-    <w:p xmlns:wp14="http://schemas.microsoft.com/office/word/2010/wordml" wp14:textId="77777777">
+    <w:p>
       <w:pPr>
+        <w:pStyle w:val="Normal"/>
         <w:ind w:left="-90"/>
         <w:rPr>
           <w:rFonts w:ascii="Times New Roman" w:hAnsi="Times New Roman" w:eastAsia="Times New Roman" w:cs="Times New Roman"/>
-          <w:b/>
-          <w:bCs/>
-          <w:color w:val="000000"/>
+          <w:b w:val="1"/>
+          <w:bCs w:val="1"/>
+          <w:color w:val="000000" w:themeColor="text1" w:themeTint="FF" w:themeShade="FF"/>
           <w:sz w:val="12"/>
           <w:szCs w:val="12"/>
         </w:rPr>
@@ -1456,27 +1526,26 @@
     </w:p>
     <w:tbl>
       <w:tblPr>
-        <w:tblStyle w:val="a5"/>
-        <w:tblW w:w="11010" w:type="dxa"/>
+        <w:tblW w:w="11277" w:type="dxa"/>
         <w:tblInd w:w="-3" w:type="dxa"/>
         <w:tblBorders>
-          <w:top w:val="single" w:color="000000" w:sz="4" w:space="0"/>
-          <w:left w:val="single" w:color="000000" w:sz="4" w:space="0"/>
-          <w:bottom w:val="single" w:color="000000" w:sz="4" w:space="0"/>
-          <w:right w:val="single" w:color="000000" w:sz="4" w:space="0"/>
-          <w:insideH w:val="single" w:color="000000" w:sz="4" w:space="0"/>
-          <w:insideV w:val="single" w:color="000000" w:sz="4" w:space="0"/>
+          <w:top w:val="single" w:color="000000" w:themeColor="text1" w:sz="4" w:space="0"/>
+          <w:left w:val="single" w:color="000000" w:themeColor="text1" w:sz="4" w:space="0"/>
+          <w:bottom w:val="single" w:color="000000" w:themeColor="text1" w:sz="4" w:space="0"/>
+          <w:right w:val="single" w:color="000000" w:themeColor="text1" w:sz="4" w:space="0"/>
+          <w:insideH w:val="single" w:color="000000" w:themeColor="text1" w:sz="4" w:space="0"/>
+          <w:insideV w:val="single" w:color="000000" w:themeColor="text1" w:sz="4" w:space="0"/>
         </w:tblBorders>
         <w:tblLayout w:type="fixed"/>
         <w:tblLook w:val="0600" w:firstRow="0" w:lastRow="0" w:firstColumn="0" w:lastColumn="0" w:noHBand="1" w:noVBand="1"/>
       </w:tblPr>
       <w:tblGrid>
-        <w:gridCol w:w="11010"/>
+        <w:gridCol w:w="11277"/>
       </w:tblGrid>
       <w:tr xmlns:wp14="http://schemas.microsoft.com/office/word/2010/wordml" wp14:textId="77777777">
         <w:tc>
           <w:tcPr>
-            <w:tcW w:w="11010" w:type="dxa"/>
+            <w:tcW w:w="11277" w:type="dxa"/>
             <w:tcMar>
               <w:top w:w="113" w:type="dxa"/>
               <w:left w:w="113" w:type="dxa"/>
@@ -1485,12 +1554,24 @@
             </w:tcMar>
             <w:vAlign w:val="center"/>
           </w:tcPr>
-          <w:p wp14:textId="77777777">
-            <w:r>
-              <w:rPr>
-                <w:rFonts w:ascii="Times New Roman" w:hAnsi="Times New Roman" w:eastAsia="Times New Roman" w:cs="Times New Roman"/>
-                <w:b/>
-                <w:bCs/>
+          <w:p wp14:textId="6DFACA10">
+            <w:r>
+              <w:rPr>
+                <w:rFonts w:ascii="Times New Roman" w:hAnsi="Times New Roman" w:eastAsia="Times New Roman" w:cs="Times New Roman"/>
+                <w:b w:val="1"/>
+                <w:bCs w:val="1"/>
+                <w:sz w:val="16"/>
+                <w:szCs w:val="16"/>
+              </w:rPr>
+              <w:t>Custos: Informar qual entidade custeará as diárias (hospedagem/alimentação) e deslocamento:</w:t>
+            </w:r>
+          </w:p>
+          <w:p wp14:textId="6F25317F">
+            <w:r>
+              <w:rPr>
+                <w:rFonts w:ascii="Times New Roman" w:hAnsi="Times New Roman" w:eastAsia="Times New Roman" w:cs="Times New Roman"/>
+                <w:b w:val="1"/>
+                <w:bCs w:val="1"/>
                 <w:sz w:val="16"/>
                 <w:szCs w:val="16"/>
               </w:rPr>
@@ -1505,7 +1586,7 @@
         </w:trPr>
         <w:tc>
           <w:tcPr>
-            <w:tcW w:w="11010" w:type="dxa"/>
+            <w:tcW w:w="11277" w:type="dxa"/>
             <w:tcMar>
               <w:top w:w="113" w:type="dxa"/>
               <w:left w:w="113" w:type="dxa"/>
@@ -1551,7 +1632,7 @@
         </w:trPr>
         <w:tc>
           <w:tcPr>
-            <w:tcW w:w="11010" w:type="dxa"/>
+            <w:tcW w:w="11277" w:type="dxa"/>
             <w:tcMar>
               <w:top w:w="113" w:type="dxa"/>
               <w:left w:w="113" w:type="dxa"/>
@@ -1582,26 +1663,15 @@
         </w:tc>
       </w:tr>
     </w:tbl>
-    <w:p xmlns:wp14="http://schemas.microsoft.com/office/word/2010/wordml" wp14:textId="77777777">
+    <w:p xmlns:wp14="http://schemas.microsoft.com/office/word/2010/wordml" wp14:textId="50328298">
       <w:pPr>
-        <w:ind w:left="-709"/>
+        <w:spacing w:before="100" w:beforeAutospacing="off" w:after="100" w:afterAutospacing="off" w:line="240" w:lineRule="auto"/>
         <w:jc w:val="center"/>
         <w:rPr>
           <w:rFonts w:ascii="Times New Roman" w:hAnsi="Times New Roman" w:eastAsia="Times New Roman" w:cs="Times New Roman"/>
-          <w:color w:val="000000"/>
-          <w:sz w:val="12"/>
-          <w:szCs w:val="12"/>
-        </w:rPr>
-      </w:pPr>
-    </w:p>
-    <w:p xmlns:wp14="http://schemas.microsoft.com/office/word/2010/wordml" wp14:textId="77777777">
-      <w:pPr>
-        <w:jc w:val="center"/>
-        <w:rPr>
-          <w:rFonts w:ascii="Times New Roman" w:hAnsi="Times New Roman" w:eastAsia="Times New Roman" w:cs="Times New Roman"/>
-          <w:b/>
-          <w:bCs/>
-          <w:color w:val="000000"/>
+          <w:b w:val="1"/>
+          <w:bCs w:val="1"/>
+          <w:color w:val="000000" w:themeColor="text1" w:themeTint="FF" w:themeShade="FF"/>
           <w:sz w:val="16"/>
           <w:szCs w:val="16"/>
         </w:rPr>
@@ -1609,7 +1679,7 @@
       <w:r>
         <w:rPr>
           <w:rFonts w:ascii="Times New Roman" w:hAnsi="Times New Roman" w:eastAsia="Times New Roman" w:cs="Times New Roman"/>
-          <w:color w:val="000000"/>
+          <w:color w:val="000000" w:themeColor="text1" w:themeTint="FF" w:themeShade="FF"/>
           <w:sz w:val="16"/>
           <w:szCs w:val="16"/>
         </w:rPr>
@@ -1618,26 +1688,14 @@
       <w:r>
         <w:rPr>
           <w:rFonts w:ascii="Times New Roman" w:hAnsi="Times New Roman" w:eastAsia="Times New Roman" w:cs="Times New Roman"/>
-          <w:b/>
-          <w:bCs/>
-          <w:color w:val="000000"/>
+          <w:b w:val="1"/>
+          <w:bCs w:val="1"/>
+          <w:color w:val="000000" w:themeColor="text1" w:themeTint="FF" w:themeShade="FF"/>
           <w:sz w:val="16"/>
           <w:szCs w:val="16"/>
         </w:rPr>
         <w:t xml:space="preserve">, </w:t>
       </w:r>
-    </w:p>
-    <w:p xmlns:wp14="http://schemas.microsoft.com/office/word/2010/wordml" wp14:textId="77777777">
-      <w:pPr>
-        <w:jc w:val="center"/>
-        <w:rPr>
-          <w:rFonts w:ascii="Times New Roman" w:hAnsi="Times New Roman" w:eastAsia="Times New Roman" w:cs="Times New Roman"/>
-          <w:b/>
-          <w:bCs/>
-          <w:sz w:val="8"/>
-          <w:szCs w:val="8"/>
-        </w:rPr>
-      </w:pPr>
     </w:p>
     <w:p xmlns:wp14="http://schemas.microsoft.com/office/word/2010/wordml" wp14:textId="77777777">
       <w:pPr>
@@ -1699,7 +1757,7 @@
       <w:headerReference w:type="default" r:id="rId6"/>
       <w:footerReference w:type="default" r:id="rId7"/>
       <w:pgSz w:w="11909" w:h="16834" w:orient="portrait"/>
-      <w:pgMar w:top="720" w:right="389" w:bottom="720" w:left="450" w:header="720" w:footer="283" w:gutter="0"/>
+      <w:pgMar w:top="720" w:right="389" w:bottom="720" w:left="360" w:header="720" w:footer="283" w:gutter="0"/>
       <w:pgNumType w:start="1"/>
       <w:cols w:space="720"/>
     </w:sectPr>

</xml_diff>

<commit_message>
feat: Implement new scheduling feature for work plans
- Added new templates for managing work plan schedules, including list, form, and confirmation pages.
- Introduced functionality for creating, editing, and deleting schedule entries.
- Enhanced the event wizard with a daily round-trip mode, allowing automatic generation of travel loops.
- Updated the event details page to display linked documents and daily allowances with improved layout.
- Refactored existing code for better readability and maintainability.
</commit_message>
<xml_diff>
--- a/eventos/resources/documentos/oficio_model.docx
+++ b/eventos/resources/documentos/oficio_model.docx
@@ -2323,7 +2323,25 @@
         <w:sz w:val="21"/>
         <w:szCs w:val="21"/>
       </w:rPr>
-      <w:t>{{unidade}}</w:t>
+      <w:t>{{unidade</w:t>
+    </w:r>
+    <w:r>
+      <w:rPr>
+        <w:b w:val="1"/>
+        <w:bCs w:val="1"/>
+        <w:sz w:val="21"/>
+        <w:szCs w:val="21"/>
+      </w:rPr>
+      <w:t>_cabecalho</w:t>
+    </w:r>
+    <w:r>
+      <w:rPr>
+        <w:b w:val="1"/>
+        <w:bCs w:val="1"/>
+        <w:sz w:val="21"/>
+        <w:szCs w:val="21"/>
+      </w:rPr>
+      <w:t>}}</w:t>
     </w:r>
   </w:p>
 </w:hdr>

</xml_diff>